<commit_message>
Expand Future Scope roadmaps in README.md and project_report.docx
</commit_message>
<xml_diff>
--- a/README_ASSETS/docs/project_report.docx
+++ b/README_ASSETS/docs/project_report.docx
@@ -1901,8 +1901,263 @@
       </w:r>
     </w:p>
     <w:p>
+      <w:pPr>
+        <w:pStyle w:val="Heading2"/>
+        <w:keepNext/>
+        <w:spacing w:before="240" w:after="120"/>
+      </w:pPr>
       <w:r>
-        <w:t>Future enhancements include: (1) Integrating the official Agmarknet API to track local mandi prices. (2) Adding support for offline access via Service Workers, allowing crop guides to load without internet. (3) Expanding voice assistant support to Tamil, Telugu, and Marathi.</w:t>
+        <w:rPr>
+          <w:rFonts w:ascii="Plus Jakarta Sans" w:hAnsi="Plus Jakarta Sans"/>
+          <w:b/>
+          <w:color w:val="2563EB"/>
+          <w:sz w:val="30"/>
+        </w:rPr>
+        <w:t>Data &amp; Intelligence</w:t>
+      </w:r>
+    </w:p>
+    <w:p>
+      <w:pPr>
+        <w:pStyle w:val="ListBullet"/>
+      </w:pPr>
+      <w:r>
+        <w:rPr>
+          <w:b/>
+        </w:rPr>
+        <w:t xml:space="preserve">IoT Soil Sensors: </w:t>
+      </w:r>
+      <w:r>
+        <w:t>Integrate low-cost soil moisture/humidity sensors so irrigation advice uses real field data instead of manual inputs.</w:t>
+      </w:r>
+    </w:p>
+    <w:p>
+      <w:pPr>
+        <w:pStyle w:val="ListBullet"/>
+      </w:pPr>
+      <w:r>
+        <w:rPr>
+          <w:b/>
+        </w:rPr>
+        <w:t xml:space="preserve">Yield Prediction: </w:t>
+      </w:r>
+      <w:r>
+        <w:t>Introduce ML models combining historical yield, weather, and soil data to forecast harvest output per crop.</w:t>
+      </w:r>
+    </w:p>
+    <w:p>
+      <w:pPr>
+        <w:pStyle w:val="ListBullet"/>
+      </w:pPr>
+      <w:r>
+        <w:rPr>
+          <w:b/>
+        </w:rPr>
+        <w:t xml:space="preserve">Satellite &amp; Drone Crop Monitoring: </w:t>
+      </w:r>
+      <w:r>
+        <w:t>NDVI-based health imagery for larger farms, complementing the phone-camera disease scanner.</w:t>
+      </w:r>
+    </w:p>
+    <w:p>
+      <w:pPr>
+        <w:pStyle w:val="ListBullet"/>
+      </w:pPr>
+      <w:r>
+        <w:rPr>
+          <w:b/>
+        </w:rPr>
+        <w:t xml:space="preserve">Soil Health Card Integration: </w:t>
+      </w:r>
+      <w:r>
+        <w:t>Pull real soil test data from India's government Soil Health Card database into the Crop Guide.</w:t>
+      </w:r>
+    </w:p>
+    <w:p>
+      <w:pPr>
+        <w:pStyle w:val="Heading2"/>
+        <w:keepNext/>
+        <w:spacing w:before="240" w:after="120"/>
+      </w:pPr>
+      <w:r>
+        <w:rPr>
+          <w:rFonts w:ascii="Plus Jakarta Sans" w:hAnsi="Plus Jakarta Sans"/>
+          <w:b/>
+          <w:color w:val="2563EB"/>
+          <w:sz w:val="30"/>
+        </w:rPr>
+        <w:t>Access &amp; Reach</w:t>
+      </w:r>
+    </w:p>
+    <w:p>
+      <w:pPr>
+        <w:pStyle w:val="ListBullet"/>
+      </w:pPr>
+      <w:r>
+        <w:rPr>
+          <w:b/>
+        </w:rPr>
+        <w:t xml:space="preserve">WhatsApp &amp; SMS Bot: </w:t>
+      </w:r>
+      <w:r>
+        <w:t>Bring the AI assistant to feature phones via WhatsApp Business API or SMS, for farmers without a smartphone.</w:t>
+      </w:r>
+    </w:p>
+    <w:p>
+      <w:pPr>
+        <w:pStyle w:val="ListBullet"/>
+      </w:pPr>
+      <w:r>
+        <w:rPr>
+          <w:b/>
+        </w:rPr>
+        <w:t xml:space="preserve">Offline-First Mode: </w:t>
+      </w:r>
+      <w:r>
+        <w:t>Support Service Workers so crop guides and planners work without active internet connections.</w:t>
+      </w:r>
+    </w:p>
+    <w:p>
+      <w:pPr>
+        <w:pStyle w:val="ListBullet"/>
+      </w:pPr>
+      <w:r>
+        <w:rPr>
+          <w:b/>
+        </w:rPr>
+        <w:t xml:space="preserve">More Regional Languages: </w:t>
+      </w:r>
+      <w:r>
+        <w:t>Expand support to other regional dialects such as Marathi, Odia, Tamil, Punjabi, and Telugu.</w:t>
+      </w:r>
+    </w:p>
+    <w:p>
+      <w:pPr>
+        <w:pStyle w:val="Heading2"/>
+        <w:keepNext/>
+        <w:spacing w:before="240" w:after="120"/>
+      </w:pPr>
+      <w:r>
+        <w:rPr>
+          <w:rFonts w:ascii="Plus Jakarta Sans" w:hAnsi="Plus Jakarta Sans"/>
+          <w:b/>
+          <w:color w:val="2563EB"/>
+          <w:sz w:val="30"/>
+        </w:rPr>
+        <w:t>Money &amp; Market</w:t>
+      </w:r>
+    </w:p>
+    <w:p>
+      <w:pPr>
+        <w:pStyle w:val="ListBullet"/>
+      </w:pPr>
+      <w:r>
+        <w:rPr>
+          <w:b/>
+        </w:rPr>
+        <w:t xml:space="preserve">Live Mandi Prices via Agmarknet: </w:t>
+      </w:r>
+      <w:r>
+        <w:t>Replace simulated pricing data with real, live district-level rates from Agmarknet API.</w:t>
+      </w:r>
+    </w:p>
+    <w:p>
+      <w:pPr>
+        <w:pStyle w:val="ListBullet"/>
+      </w:pPr>
+      <w:r>
+        <w:rPr>
+          <w:b/>
+        </w:rPr>
+        <w:t xml:space="preserve">Direct-to-Buyer Marketplace: </w:t>
+      </w:r>
+      <w:r>
+        <w:t>Connect farmers directly with local buyers and FPOs to cut out middlemen.</w:t>
+      </w:r>
+    </w:p>
+    <w:p>
+      <w:pPr>
+        <w:pStyle w:val="ListBullet"/>
+      </w:pPr>
+      <w:r>
+        <w:rPr>
+          <w:b/>
+        </w:rPr>
+        <w:t xml:space="preserve">Govt. Scheme &amp; Subsidy Advisor: </w:t>
+      </w:r>
+      <w:r>
+        <w:t>Gemma-powered eligibility checks for PM-KISAN, crop insurance (PMFBY), and state subsidies.</w:t>
+      </w:r>
+    </w:p>
+    <w:p>
+      <w:pPr>
+        <w:pStyle w:val="ListBullet"/>
+      </w:pPr>
+      <w:r>
+        <w:rPr>
+          <w:b/>
+        </w:rPr>
+        <w:t xml:space="preserve">Micro-finance/Loan Advisory: </w:t>
+      </w:r>
+      <w:r>
+        <w:t>Surface relevant agricultural loan products based on farm size and crop cycle.</w:t>
+      </w:r>
+    </w:p>
+    <w:p>
+      <w:pPr>
+        <w:pStyle w:val="Heading2"/>
+        <w:keepNext/>
+        <w:spacing w:before="240" w:after="120"/>
+      </w:pPr>
+      <w:r>
+        <w:rPr>
+          <w:rFonts w:ascii="Plus Jakarta Sans" w:hAnsi="Plus Jakarta Sans"/>
+          <w:b/>
+          <w:color w:val="2563EB"/>
+          <w:sz w:val="30"/>
+        </w:rPr>
+        <w:t>Community &amp; Engagement</w:t>
+      </w:r>
+    </w:p>
+    <w:p>
+      <w:pPr>
+        <w:pStyle w:val="ListBullet"/>
+      </w:pPr>
+      <w:r>
+        <w:rPr>
+          <w:b/>
+        </w:rPr>
+        <w:t xml:space="preserve">Peer Farmer Forum: </w:t>
+      </w:r>
+      <w:r>
+        <w:t>Regional community Q&amp;A, moderated with Gemma for spam/misinformation filtering.</w:t>
+      </w:r>
+    </w:p>
+    <w:p>
+      <w:pPr>
+        <w:pStyle w:val="ListBullet"/>
+      </w:pPr>
+      <w:r>
+        <w:rPr>
+          <w:b/>
+        </w:rPr>
+        <w:t xml:space="preserve">Proactive Alert System: </w:t>
+      </w:r>
+      <w:r>
+        <w:t>Crowd-sourced pest/disease outbreak warnings pushed to nearby farmers automatically.</w:t>
+      </w:r>
+    </w:p>
+    <w:p>
+      <w:pPr>
+        <w:pStyle w:val="ListBullet"/>
+      </w:pPr>
+      <w:r>
+        <w:rPr>
+          <w:b/>
+        </w:rPr>
+        <w:t xml:space="preserve">FPO &amp; Enterprise Dashboard: </w:t>
+      </w:r>
+      <w:r>
+        <w:t>An aggregate view for Farmer Producer Organizations managing many member farmers at once.</w:t>
       </w:r>
     </w:p>
     <w:p>

</xml_diff>

<commit_message>
Elaborate Team and Contributors details in README.md and project_report.docx
</commit_message>
<xml_diff>
--- a/README_ASSETS/docs/project_report.docx
+++ b/README_ASSETS/docs/project_report.docx
@@ -2225,6 +2225,69 @@
     </w:p>
     <w:p>
       <w:pPr>
+        <w:pStyle w:val="Heading2"/>
+        <w:keepNext/>
+        <w:spacing w:before="240" w:after="120"/>
+      </w:pPr>
+      <w:r>
+        <w:rPr>
+          <w:rFonts w:ascii="Plus Jakarta Sans" w:hAnsi="Plus Jakarta Sans"/>
+          <w:b/>
+          <w:color w:val="2563EB"/>
+          <w:sz w:val="30"/>
+        </w:rPr>
+        <w:t>Project Contributors</w:t>
+      </w:r>
+    </w:p>
+    <w:p>
+      <w:pPr>
+        <w:pStyle w:val="ListBullet"/>
+      </w:pPr>
+      <w:r>
+        <w:rPr>
+          <w:b/>
+        </w:rPr>
+        <w:t xml:space="preserve">Aman Mondal (Lead Frontend Engineer): </w:t>
+      </w:r>
+      <w:r>
+        <w:t>UI Architecture, modern glassmorphism styling design systems, Framer Motion transitions, and client API data binding integrations.</w:t>
+      </w:r>
+    </w:p>
+    <w:p>
+      <w:pPr>
+        <w:pStyle w:val="ListBullet"/>
+      </w:pPr>
+      <w:r>
+        <w:rPr>
+          <w:b/>
+        </w:rPr>
+        <w:t xml:space="preserve">Waish Alam (Lead Backend &amp; AI Engineer): </w:t>
+      </w:r>
+      <w:r>
+        <w:t>AI model endpoint connections, Speech-to-Text and Text-to-Speech client loops, Firestore NoSQL collection structures, and security policy rules configuration.</w:t>
+      </w:r>
+    </w:p>
+    <w:p>
+      <w:pPr>
+        <w:pStyle w:val="ListBullet"/>
+      </w:pPr>
+      <w:r>
+        <w:rPr>
+          <w:b/>
+        </w:rPr>
+        <w:t xml:space="preserve">Anushka Verma (Documentation &amp; Presentation Lead): </w:t>
+      </w:r>
+      <w:r>
+        <w:t>Project writeup research compiling, database diagrams planning, and video demonstration production pipelines.</w:t>
+      </w:r>
+    </w:p>
+    <w:p>
+      <w:r>
+        <w:br w:type="page"/>
+      </w:r>
+    </w:p>
+    <w:p>
+      <w:pPr>
         <w:pStyle w:val="ListBullet"/>
       </w:pPr>
       <w:r>

</xml_diff>

<commit_message>
Update official Kaggle competition links and project contact headers
</commit_message>
<xml_diff>
--- a/README_ASSETS/docs/project_report.docx
+++ b/README_ASSETS/docs/project_report.docx
@@ -439,7 +439,7 @@
         <w:br/>
         <w:t>8. Objectives ......................................................................................................... 8</w:t>
         <w:br/>
-        <w:t>9. Proposed Solution ................................................................................................. 9</w:t>
+        <w:t>9. Proposed Solution .................................─────────────────────────────────────────────── 9</w:t>
         <w:br/>
         <w:t>10. Key Features ................................................................................................... 10</w:t>
         <w:br/>
@@ -2236,7 +2236,21 @@
           <w:color w:val="2563EB"/>
           <w:sz w:val="30"/>
         </w:rPr>
-        <w:t>Project Contributors</w:t>
+        <w:t>Project Lead &amp; Contributors</w:t>
+      </w:r>
+    </w:p>
+    <w:p>
+      <w:pPr>
+        <w:pStyle w:val="ListBullet"/>
+      </w:pPr>
+      <w:r>
+        <w:rPr>
+          <w:b/>
+        </w:rPr>
+        <w:t xml:space="preserve">Waish Alam (Project &amp; AI Lead): </w:t>
+      </w:r>
+      <w:r>
+        <w:t>Email: waishalam228@gmail.com | GitHub: https://github.com/Waish228. Managed AI configurations, Speech-to-Text and Text-to-Speech loop hooks, Firestore schemas, and security layouts.</w:t>
       </w:r>
     </w:p>
     <w:p>
@@ -2250,21 +2264,7 @@
         <w:t xml:space="preserve">Aman Mondal (Lead Frontend Engineer): </w:t>
       </w:r>
       <w:r>
-        <w:t>UI Architecture, modern glassmorphism styling design systems, Framer Motion transitions, and client API data binding integrations.</w:t>
-      </w:r>
-    </w:p>
-    <w:p>
-      <w:pPr>
-        <w:pStyle w:val="ListBullet"/>
-      </w:pPr>
-      <w:r>
-        <w:rPr>
-          <w:b/>
-        </w:rPr>
-        <w:t xml:space="preserve">Waish Alam (Lead Backend &amp; AI Engineer): </w:t>
-      </w:r>
-      <w:r>
-        <w:t>AI model endpoint connections, Speech-to-Text and Text-to-Speech client loops, Firestore NoSQL collection structures, and security policy rules configuration.</w:t>
+        <w:t>Developed frontend responsive dashboard interfaces, dynamic settings panels, and Framer Motion transitions.</w:t>
       </w:r>
     </w:p>
     <w:p>
@@ -2278,7 +2278,7 @@
         <w:t xml:space="preserve">Anushka Verma (Documentation &amp; Presentation Lead): </w:t>
       </w:r>
       <w:r>
-        <w:t>Project writeup research compiling, database diagrams planning, and video demonstration production pipelines.</w:t>
+        <w:t>Researching agricultural contexts, writing official briefs, and producing demo assets.</w:t>
       </w:r>
     </w:p>
     <w:p>

</xml_diff>

<commit_message>
Elaborate Challenges Faced section in README.md and project_report.docx
</commit_message>
<xml_diff>
--- a/README_ASSETS/docs/project_report.docx
+++ b/README_ASSETS/docs/project_report.docx
@@ -439,7 +439,7 @@
         <w:br/>
         <w:t>8. Objectives ......................................................................................................... 8</w:t>
         <w:br/>
-        <w:t>9. Proposed Solution .................................─────────────────────────────────────────────── 9</w:t>
+        <w:t>9. Proposed Solution ................................................................................................. 9</w:t>
         <w:br/>
         <w:t>10. Key Features ................................................................................................... 10</w:t>
         <w:br/>
@@ -1799,7 +1799,7 @@
         <w:br/>
       </w:r>
       <w:r>
-        <w:t xml:space="preserve">  Solution: Experimental endpoints occasionally return HTTP 500/503 errors. We resolved this by implementing an exponential backoff loop in client.ts that retries requests up to 10 times before reporting an error.</w:t>
+        <w:t xml:space="preserve">  Solution: Swapping backend models to the denser gemma-4-31b-it on beta endpoints occasionally triggered internal server failures (HTTP 500). We solved this by implementing a centralized 10-attempt exponential backoff retry loop for all API client queries.</w:t>
         <w:br/>
       </w:r>
     </w:p>
@@ -1808,11 +1808,50 @@
         <w:rPr>
           <w:b/>
         </w:rPr>
-        <w:t>• Challenge: Web Speech Audio Clogging</w:t>
+        <w:t>• Challenge: Speech Synthesis Queue Clogging</w:t>
         <w:br/>
       </w:r>
       <w:r>
         <w:t xml:space="preserve">  Solution: Frequent voice inputs can cause SpeechSynthesis to fail silently in the browser. We solved this by adding cancellation rules in the speech hook that clear the browser audio queue (speechSynthesis.cancel()), wait 400ms, and retry up to 10 times.</w:t>
+        <w:br/>
+      </w:r>
+    </w:p>
+    <w:p>
+      <w:r>
+        <w:rPr>
+          <w:b/>
+        </w:rPr>
+        <w:t>• Challenge: TypeScript Web Speech Typings</w:t>
+        <w:br/>
+      </w:r>
+      <w:r>
+        <w:t xml:space="preserve">  Solution: The browser SpeechRecognition classes trigger compiler warnings due to missing built-in types on global window objects. We resolved this by declaring explicit global type overrides (webkitSpeechRecognition interfaces) at the top of the hook.</w:t>
+        <w:br/>
+      </w:r>
+    </w:p>
+    <w:p>
+      <w:r>
+        <w:rPr>
+          <w:b/>
+        </w:rPr>
+        <w:t>• Challenge: User State Hydration &amp; Authentication Redirects</w:t>
+        <w:br/>
+      </w:r>
+      <w:r>
+        <w:t xml:space="preserve">  Solution: Integrating Firebase Authentication with Firestore profile queries led to page refresh crashes. We resolved this by building a customized React Auth Context that tracks hydration state before letting routes evaluate.</w:t>
+        <w:br/>
+      </w:r>
+    </w:p>
+    <w:p>
+      <w:r>
+        <w:rPr>
+          <w:b/>
+        </w:rPr>
+        <w:t>• Challenge: Browser Geolocation Blocks &amp; Cache Invalidation</w:t>
+        <w:br/>
+      </w:r>
+      <w:r>
+        <w:t xml:space="preserve">  Solution: Restrictive sandbox permissions blocked coordinates access. We implemented fallback location overrides (defaulting to Lucknow) and integrated OSM reverse-geocoding coordinates translations.</w:t>
         <w:br/>
       </w:r>
     </w:p>

</xml_diff>